<commit_message>
Fix hanging indent, remove spaces before punctuation, make the pipeline portable
- engine: line 2 now starts exactly where the regular text of line 1 starts (line-2 width follows the
  justified gap of line 1; canvas measured RTL); line 2 can no longer open a column, so no stray indent at column tops
- build.js: self-check of the hanging indent (all 1276 hung lines aligned, none at a column top)
- book.py: remove typed spaces before , . ; : (ellipsis kept); sources found by original file names (src_names.json)
- run_all.py (cross-platform), README with setup, fonts and design decisions; playwright path no longer hard-coded
- refreshed booklet PDF/DOCX and the source-notes (bracket issues listed, not corrected)

Co-Authored-By: Claude Sonnet 5.5 <noreply@anthropic.com>
Claude-Session: https://claude.ai/code/session_0161ijXJJcwCxR7y44e5HXLU
</commit_message>
<xml_diff>
--- a/output/pilpula-daoraita.docx
+++ b/output/pilpula-daoraita.docx
@@ -7721,7 +7721,7 @@
         <w:t xml:space="preserve">נמצא</w:t>
       </w:r>
       <w:r>
-        <w:t xml:space="preserve"> בדעת הרמב״ם או שסבר שיש ב׳ נטילות .</w:t>
+        <w:t xml:space="preserve"> בדעת הרמב״ם או שסבר שיש ב׳ נטילות.</w:t>
       </w:r>
     </w:p>
     <w:p>
@@ -33619,7 +33619,7 @@
         <w:rPr>
           <w:rStyle w:val="SmallSource"/>
         </w:rPr>
-        <w:t xml:space="preserve">[או אחת קצרה ואחת ארוכה עיין רש״י ותוס׳ שם על המשנה .]</w:t>
+        <w:t xml:space="preserve">[או אחת קצרה ואחת ארוכה עיין רש״י ותוס׳ שם על המשנה.]</w:t>
       </w:r>
       <w:r>
         <w:t xml:space="preserve"> לכך זהו הטעם שהיתה הו,א שנימא שהברכות הללו יעכבו את הקר״ש קמ״ל שאין הברכות מעכבות.</w:t>
@@ -35986,7 +35986,7 @@
         <w:t xml:space="preserve">והנה</w:t>
       </w:r>
       <w:r>
-        <w:t xml:space="preserve"> כתב שם המהרש״א בחידושי אגדות .] לבאר שיש לאמר שמה שמצינו הכא על יעקב אחרי שהוא שמע מבניו שהזיכרו את ם ה׳ הוא אמר אחריהם ברוך שם כבוד מלכותו לעולם ועד.</w:t>
+        <w:t xml:space="preserve"> כתב שם המהרש״א בחידושי אגדות.] לבאר שיש לאמר שמה שמצינו הכא על יעקב אחרי שהוא שמע מבניו שהזיכרו את ם ה׳ הוא אמר אחריהם ברוך שם כבוד מלכותו לעולם ועד.</w:t>
       </w:r>
     </w:p>
     <w:p>
@@ -36109,7 +36109,7 @@
         <w:t xml:space="preserve">ולכך</w:t>
       </w:r>
       <w:r>
-        <w:t xml:space="preserve"> כתב לחדש שכל עיקר הקפידא הוא רק היכא שאכן הוא קורא קר״ש ואז אכן יש את החשש של ההפסק אומנם אם הוא אומר סתם שמע ישראל בלחוד או רק בשכמל״ו אין הוא צריך לאומרו בלחש .</w:t>
+        <w:t xml:space="preserve"> כתב לחדש שכל עיקר הקפידא הוא רק היכא שאכן הוא קורא קר״ש ואז אכן יש את החשש של ההפסק אומנם אם הוא אומר סתם שמע ישראל בלחוד או רק בשכמל״ו אין הוא צריך לאומרו בלחש.</w:t>
       </w:r>
     </w:p>
     <w:p>
@@ -36178,7 +36178,7 @@
         <w:rPr>
           <w:rStyle w:val="SmallSource"/>
         </w:rPr>
-        <w:t xml:space="preserve">[סא .ג]</w:t>
+        <w:t xml:space="preserve">[סא.ג]</w:t>
       </w:r>
       <w:r>
         <w:t xml:space="preserve"> שהביא מי שאומר לאמר ״קל מלך נאמן״ בקר״ש בכדי להשלים לרמ״ח תיבות בקר״ש</w:t>
@@ -36196,7 +36196,7 @@
         <w:t xml:space="preserve">אומנם</w:t>
       </w:r>
       <w:r>
-        <w:t xml:space="preserve"> כתב שהיד רמ״ה פליג על כך משום שסו״ס משה רבינו לא אמרו שאם אמרו גבי בשכמל״ו שיעקב אמרו שחשיב שלא לאומרו בקול רם משום שמשה לא אמרו כ״ש ״קל מלך נאמן״ שאין לאומרו משום שמשה לא אמרו .</w:t>
+        <w:t xml:space="preserve"> כתב שהיד רמ״ה פליג על כך משום שסו״ס משה רבינו לא אמרו שאם אמרו גבי בשכמל״ו שיעקב אמרו שחשיב שלא לאומרו בקול רם משום שמשה לא אמרו כ״ש ״קל מלך נאמן״ שאין לאומרו משום שמשה לא אמרו.</w:t>
       </w:r>
     </w:p>
     <w:p>
@@ -37321,7 +37321,7 @@
         <w:t xml:space="preserve">והנה</w:t>
       </w:r>
       <w:r>
-        <w:t xml:space="preserve"> כתב שם המהרש״א בחידושי אגדות .] לבאר שיש</w:t>
+        <w:t xml:space="preserve"> כתב שם המהרש״א בחידושי אגדות.] לבאר שיש</w:t>
       </w:r>
     </w:p>
     <w:p>
@@ -37561,7 +37561,7 @@
         <w:rPr>
           <w:rStyle w:val="SmallSource"/>
         </w:rPr>
-        <w:t xml:space="preserve">[סא .ג]</w:t>
+        <w:t xml:space="preserve">[סא.ג]</w:t>
       </w:r>
       <w:r>
         <w:t xml:space="preserve"> שהביא מי שאומר לאמר ״קל מלך נאמן״ בקר״ש בכדי להשלים לרמ״ח תיבות בקר״ש</w:t>
@@ -37579,7 +37579,7 @@
         <w:t xml:space="preserve">אומנם</w:t>
       </w:r>
       <w:r>
-        <w:t xml:space="preserve"> כתב שהיד רמ״ה פליג על כך משום שסו״ס משה רבינו לא אמרו שאם אמרו גבי בשכמל״ו שיעקב אמרו  שלא לאומרו בקול רם משום שמשה לא אמרו כ״ש ״קל מלך נאמן״ שאין לאומרו משום שמשה לא אמרו .</w:t>
+        <w:t xml:space="preserve"> כתב שהיד רמ״ה פליג על כך משום שסו״ס משה רבינו לא אמרו שאם אמרו גבי בשכמל״ו שיעקב אמרו  שלא לאומרו בקול רם משום שמשה לא אמרו כ״ש ״קל מלך נאמן״ שאין לאומרו משום שמשה לא אמרו.</w:t>
       </w:r>
     </w:p>
     <w:p>
@@ -38770,7 +38770,7 @@
         <w:rPr>
           <w:rStyle w:val="SmallSource"/>
         </w:rPr>
-        <w:t xml:space="preserve">[מלכים א׳ יח לט .]</w:t>
+        <w:t xml:space="preserve">[מלכים א׳ יח לט.]</w:t>
       </w:r>
       <w:r>
         <w:t xml:space="preserve"> כיון שמצינו שהפסוק כופל אותו אין לחוש ע״כ.</w:t>

</xml_diff>